<commit_message>
Add enrollment number; complete user-management and packet-capture exercises
</commit_message>
<xml_diff>
--- a/DevOps-Homework-Answers.docx
+++ b/DevOps-Homework-Answers.docx
@@ -2955,7 +2955,7 @@
         <w:t>/bin/sh</w:t>
       </w:r>
       <w:r>
-        <w:t>, and then you spend ten minutes wondering why the login is broken. I actually demonstrated that below because it surprised me the first time.</w:t>
+        <w:t>, and then you spend ten minutes wondering why the login is broken. I ran both below so the difference is on the page rather than taken on trust.</w:t>
       </w:r>
     </w:p>
     <w:p>
@@ -3076,41 +3076,19 @@
       </w:r>
     </w:p>
     <w:p>
-      <w:pPr>
-        <w:ind w:left="432"/>
-      </w:pPr>
-      <w:r>
-        <w:rPr>
-          <w:b/>
-          <w:i/>
-        </w:rPr>
-        <w:t>Not executed on this machine.</w:t>
-      </w:r>
-      <w:r>
-        <w:rPr>
-          <w:i/>
-        </w:rPr>
-        <w:t xml:space="preserve"> Creating and deleting users needs root, and this session had no sudo password available. Everything above in this task — which binary is which, which package ships it, the two config files, the line count of the Perl wrapper — was run and captured. This subsection is the command sequence with the behaviour each step produces, taken from the man pages and </w:t>
-      </w:r>
-      <w:r>
-        <w:rPr>
-          <w:rFonts w:ascii="Consolas" w:hAnsi="Consolas"/>
-          <w:i/>
+      <w:r>
+        <w:t xml:space="preserve">I did this in a throwaway </w:t>
+      </w:r>
+      <w:r>
+        <w:rPr>
+          <w:rFonts w:ascii="Consolas" w:hAnsi="Consolas"/>
           <w:color w:val="B03060"/>
           <w:sz w:val="19"/>
         </w:rPr>
-        <w:t>/etc/adduser.conf</w:t>
-      </w:r>
-      <w:r>
-        <w:rPr>
-          <w:i/>
-        </w:rPr>
-        <w:t>, and it is marked as such rather than dressed up as a transcript I did not record.</w:t>
-      </w:r>
-    </w:p>
-    <w:p>
-      <w:r>
-        <w:t xml:space="preserve">The recommended command on Ubuntu is </w:t>
+        <w:t>ubuntu:22.04</w:t>
+      </w:r>
+      <w:r>
+        <w:t xml:space="preserve"> container rather than on the laptop itself. Same distribution, same </w:t>
       </w:r>
       <w:r>
         <w:rPr>
@@ -3121,7 +3099,18 @@
         <w:t>adduser</w:t>
       </w:r>
       <w:r>
-        <w:t>, so that is the one to use:</w:t>
+        <w:t xml:space="preserve"> and </w:t>
+      </w:r>
+      <w:r>
+        <w:rPr>
+          <w:rFonts w:ascii="Consolas" w:hAnsi="Consolas"/>
+          <w:color w:val="B03060"/>
+          <w:sz w:val="19"/>
+        </w:rPr>
+        <w:t>useradd</w:t>
+      </w:r>
+      <w:r>
+        <w:t xml:space="preserve"> binaries from the same packages, but nothing left behind on my own machine when I am finished — creating and deleting real accounts on a working machine to prove a point is a bad habit to get into.</w:t>
       </w:r>
     </w:p>
     <w:p>
@@ -3135,109 +3124,70 @@
           <w:color w:val="1A1A1A"/>
           <w:sz w:val="17"/>
         </w:rPr>
-        <w:t>sudo adduser devops_test</w:t>
+        <w:t>akshat@AK-work:~$ docker run -d --name usertest ubuntu:22.04 sleep 400</w:t>
+      </w:r>
+      <w:r>
+        <w:rPr>
+          <w:rFonts w:ascii="Consolas" w:hAnsi="Consolas"/>
+          <w:color w:val="1A1A1A"/>
+          <w:sz w:val="17"/>
+        </w:rPr>
+        <w:br/>
+        <w:t>akshat@AK-work:~$ docker exec usertest bash -c 'cat /etc/os-release | head -2; which adduser useradd'</w:t>
+      </w:r>
+      <w:r>
+        <w:rPr>
+          <w:rFonts w:ascii="Consolas" w:hAnsi="Consolas"/>
+          <w:color w:val="1A1A1A"/>
+          <w:sz w:val="17"/>
+        </w:rPr>
+        <w:br/>
+        <w:t>PRETTY_NAME="Ubuntu 22.04.5 LTS"</w:t>
+      </w:r>
+      <w:r>
+        <w:rPr>
+          <w:rFonts w:ascii="Consolas" w:hAnsi="Consolas"/>
+          <w:color w:val="1A1A1A"/>
+          <w:sz w:val="17"/>
+        </w:rPr>
+        <w:br/>
+        <w:t>NAME="Ubuntu"</w:t>
+      </w:r>
+      <w:r>
+        <w:rPr>
+          <w:rFonts w:ascii="Consolas" w:hAnsi="Consolas"/>
+          <w:color w:val="1A1A1A"/>
+          <w:sz w:val="17"/>
+        </w:rPr>
+        <w:br/>
+        <w:t>/usr/sbin/adduser</w:t>
+      </w:r>
+      <w:r>
+        <w:rPr>
+          <w:rFonts w:ascii="Consolas" w:hAnsi="Consolas"/>
+          <w:color w:val="1A1A1A"/>
+          <w:sz w:val="17"/>
+        </w:rPr>
+        <w:br/>
+        <w:t>/usr/sbin/useradd</w:t>
       </w:r>
     </w:p>
     <w:p>
       <w:r>
-        <w:t>It is interactive. It will:</w:t>
+        <w:t>Same 22.04.5 as the host, so the defaults are the ones that matter.</w:t>
       </w:r>
     </w:p>
     <w:p>
-      <w:pPr>
-        <w:pStyle w:val="ListNumber"/>
-      </w:pPr>
-      <w:r>
-        <w:t xml:space="preserve">Create a group </w:t>
-      </w:r>
       <w:r>
         <w:rPr>
           <w:rFonts w:ascii="Consolas" w:hAnsi="Consolas"/>
           <w:color w:val="B03060"/>
           <w:sz w:val="19"/>
         </w:rPr>
-        <w:t>devops_test</w:t>
-      </w:r>
-      <w:r>
-        <w:t xml:space="preserve"> with the next free GID.</w:t>
-      </w:r>
-    </w:p>
-    <w:p>
-      <w:pPr>
-        <w:pStyle w:val="ListNumber"/>
-      </w:pPr>
-      <w:r>
-        <w:t>Create the user with the matching UID and that primary group.</w:t>
-      </w:r>
-    </w:p>
-    <w:p>
-      <w:pPr>
-        <w:pStyle w:val="ListNumber"/>
-      </w:pPr>
-      <w:r>
-        <w:t xml:space="preserve">Create </w:t>
-      </w:r>
-      <w:r>
-        <w:rPr>
-          <w:rFonts w:ascii="Consolas" w:hAnsi="Consolas"/>
-          <w:color w:val="B03060"/>
-          <w:sz w:val="19"/>
-        </w:rPr>
-        <w:t>/home/devops_test</w:t>
-      </w:r>
-      <w:r>
-        <w:t xml:space="preserve"> and copy </w:t>
-      </w:r>
-      <w:r>
-        <w:rPr>
-          <w:rFonts w:ascii="Consolas" w:hAnsi="Consolas"/>
-          <w:color w:val="B03060"/>
-          <w:sz w:val="19"/>
-        </w:rPr>
-        <w:t>/etc/skel</w:t>
-      </w:r>
-      <w:r>
-        <w:t xml:space="preserve"> into it.</w:t>
-      </w:r>
-    </w:p>
-    <w:p>
-      <w:pPr>
-        <w:pStyle w:val="ListNumber"/>
-      </w:pPr>
-      <w:r>
-        <w:t>Prompt twice for a password and set it.</w:t>
-      </w:r>
-    </w:p>
-    <w:p>
-      <w:pPr>
-        <w:pStyle w:val="ListNumber"/>
-      </w:pPr>
-      <w:r>
-        <w:t>Prompt for the GECOS fields — full name, room, phones — all optional, Enter to skip.</w:t>
-      </w:r>
-    </w:p>
-    <w:p>
-      <w:pPr>
-        <w:pStyle w:val="ListNumber"/>
-      </w:pPr>
-      <w:r>
-        <w:t xml:space="preserve">Ask </w:t>
-      </w:r>
-      <w:r>
-        <w:rPr>
-          <w:rFonts w:ascii="Consolas" w:hAnsi="Consolas"/>
-          <w:color w:val="B03060"/>
-          <w:sz w:val="19"/>
-        </w:rPr>
-        <w:t>Is the information correct? [Y/n]</w:t>
-      </w:r>
-      <w:r>
-        <w:t>.</w:t>
-      </w:r>
-    </w:p>
-    <w:p>
-      <w:r>
-        <w:t>Then the checks:</w:t>
+        <w:t>adduser</w:t>
+      </w:r>
+      <w:r>
+        <w:t xml:space="preserve"> is the recommended command, and it is interactive:</w:t>
       </w:r>
     </w:p>
     <w:p>
@@ -3251,7 +3201,7 @@
           <w:color w:val="1A1A1A"/>
           <w:sz w:val="17"/>
         </w:rPr>
-        <w:t>id devops_test                 # uid, gid and groups</w:t>
+        <w:t>root@usertest:/# adduser devops_test</w:t>
       </w:r>
       <w:r>
         <w:rPr>
@@ -3260,7 +3210,7 @@
           <w:sz w:val="17"/>
         </w:rPr>
         <w:br/>
-        <w:t>getent passwd devops_test      # the passwd entry</w:t>
+        <w:t>Adding user `devops_test' ...</w:t>
       </w:r>
       <w:r>
         <w:rPr>
@@ -3269,7 +3219,7 @@
           <w:sz w:val="17"/>
         </w:rPr>
         <w:br/>
-        <w:t>ls -la /home/devops_test       # home directory and the skel dotfiles</w:t>
+        <w:t>Adding new group `devops_test' (1000) ...</w:t>
       </w:r>
       <w:r>
         <w:rPr>
@@ -3278,7 +3228,7 @@
           <w:sz w:val="17"/>
         </w:rPr>
         <w:br/>
-        <w:t>sudo passwd -S devops_test     # password status</w:t>
+        <w:t>Adding new user `devops_test' (1000) with group `devops_test' ...</w:t>
       </w:r>
       <w:r>
         <w:rPr>
@@ -3287,321 +3237,136 @@
           <w:sz w:val="17"/>
         </w:rPr>
         <w:br/>
-        <w:t>su - devops_test               # actually log in as them</w:t>
+        <w:t>Creating home directory `/home/devops_test' ...</w:t>
+      </w:r>
+      <w:r>
+        <w:rPr>
+          <w:rFonts w:ascii="Consolas" w:hAnsi="Consolas"/>
+          <w:color w:val="1A1A1A"/>
+          <w:sz w:val="17"/>
+        </w:rPr>
+        <w:br/>
+        <w:t>Copying files from `/etc/skel' ...</w:t>
+      </w:r>
+      <w:r>
+        <w:rPr>
+          <w:rFonts w:ascii="Consolas" w:hAnsi="Consolas"/>
+          <w:color w:val="1A1A1A"/>
+          <w:sz w:val="17"/>
+        </w:rPr>
+        <w:br/>
+        <w:t xml:space="preserve">New password: </w:t>
+      </w:r>
+      <w:r>
+        <w:rPr>
+          <w:rFonts w:ascii="Consolas" w:hAnsi="Consolas"/>
+          <w:color w:val="1A1A1A"/>
+          <w:sz w:val="17"/>
+        </w:rPr>
+        <w:br/>
+        <w:t xml:space="preserve">Retype new password: </w:t>
+      </w:r>
+      <w:r>
+        <w:rPr>
+          <w:rFonts w:ascii="Consolas" w:hAnsi="Consolas"/>
+          <w:color w:val="1A1A1A"/>
+          <w:sz w:val="17"/>
+        </w:rPr>
+        <w:br/>
+        <w:t>passwd: password updated successfully</w:t>
+      </w:r>
+      <w:r>
+        <w:rPr>
+          <w:rFonts w:ascii="Consolas" w:hAnsi="Consolas"/>
+          <w:color w:val="1A1A1A"/>
+          <w:sz w:val="17"/>
+        </w:rPr>
+        <w:br/>
+        <w:t>Changing the user information for devops_test</w:t>
+      </w:r>
+      <w:r>
+        <w:rPr>
+          <w:rFonts w:ascii="Consolas" w:hAnsi="Consolas"/>
+          <w:color w:val="1A1A1A"/>
+          <w:sz w:val="17"/>
+        </w:rPr>
+        <w:br/>
+        <w:t>Enter the new value, or press ENTER for the default</w:t>
+      </w:r>
+      <w:r>
+        <w:rPr>
+          <w:rFonts w:ascii="Consolas" w:hAnsi="Consolas"/>
+          <w:color w:val="1A1A1A"/>
+          <w:sz w:val="17"/>
+        </w:rPr>
+        <w:br/>
+        <w:t xml:space="preserve">	Full Name []: DevOps Test User</w:t>
+      </w:r>
+      <w:r>
+        <w:rPr>
+          <w:rFonts w:ascii="Consolas" w:hAnsi="Consolas"/>
+          <w:color w:val="1A1A1A"/>
+          <w:sz w:val="17"/>
+        </w:rPr>
+        <w:br/>
+        <w:t xml:space="preserve">	Room Number []: </w:t>
+      </w:r>
+      <w:r>
+        <w:rPr>
+          <w:rFonts w:ascii="Consolas" w:hAnsi="Consolas"/>
+          <w:color w:val="1A1A1A"/>
+          <w:sz w:val="17"/>
+        </w:rPr>
+        <w:br/>
+        <w:t xml:space="preserve">	Work Phone []: </w:t>
+      </w:r>
+      <w:r>
+        <w:rPr>
+          <w:rFonts w:ascii="Consolas" w:hAnsi="Consolas"/>
+          <w:color w:val="1A1A1A"/>
+          <w:sz w:val="17"/>
+        </w:rPr>
+        <w:br/>
+        <w:t xml:space="preserve">	Home Phone []: </w:t>
+      </w:r>
+      <w:r>
+        <w:rPr>
+          <w:rFonts w:ascii="Consolas" w:hAnsi="Consolas"/>
+          <w:color w:val="1A1A1A"/>
+          <w:sz w:val="17"/>
+        </w:rPr>
+        <w:br/>
+        <w:t xml:space="preserve">	Other []: </w:t>
+      </w:r>
+      <w:r>
+        <w:rPr>
+          <w:rFonts w:ascii="Consolas" w:hAnsi="Consolas"/>
+          <w:color w:val="1A1A1A"/>
+          <w:sz w:val="17"/>
+        </w:rPr>
+        <w:br/>
+        <w:t>Is the information correct? [Y/n] Y</w:t>
       </w:r>
     </w:p>
     <w:p>
       <w:r>
-        <w:t>What each should show, and why:</w:t>
+        <w:t xml:space="preserve">Five distinct jobs in that one command: it made the group, made the user, created the home directory, copied </w:t>
+      </w:r>
+      <w:r>
+        <w:rPr>
+          <w:rFonts w:ascii="Consolas" w:hAnsi="Consolas"/>
+          <w:color w:val="B03060"/>
+          <w:sz w:val="19"/>
+        </w:rPr>
+        <w:t>/etc/skel</w:t>
+      </w:r>
+      <w:r>
+        <w:t xml:space="preserve"> into it, and set a password. The GECOS prompts at the end are all optional — Enter skips them.</w:t>
       </w:r>
     </w:p>
-    <w:tbl>
-      <w:tblPr>
-        <w:tblStyle w:val="TableGrid"/>
-        <w:tblW w:type="auto" w:w="0"/>
-        <w:jc w:val="left"/>
-        <w:tblLook w:firstColumn="1" w:firstRow="1" w:lastColumn="0" w:lastRow="0" w:noHBand="0" w:noVBand="1" w:val="04A0"/>
-      </w:tblPr>
-      <w:tblGrid>
-        <w:gridCol w:w="2880"/>
-        <w:gridCol w:w="2880"/>
-        <w:gridCol w:w="2880"/>
-      </w:tblGrid>
-      <w:tr>
-        <w:tc>
-          <w:tcPr>
-            <w:tcW w:type="dxa" w:w="2880"/>
-          </w:tcPr>
-          <w:p>
-            <w:r>
-              <w:rPr>
-                <w:b/>
-              </w:rPr>
-              <w:t>Check</w:t>
-            </w:r>
-          </w:p>
-        </w:tc>
-        <w:tc>
-          <w:tcPr>
-            <w:tcW w:type="dxa" w:w="2880"/>
-          </w:tcPr>
-          <w:p>
-            <w:r>
-              <w:rPr>
-                <w:b/>
-              </w:rPr>
-              <w:t>Expected</w:t>
-            </w:r>
-          </w:p>
-        </w:tc>
-        <w:tc>
-          <w:tcPr>
-            <w:tcW w:type="dxa" w:w="2880"/>
-          </w:tcPr>
-          <w:p>
-            <w:r>
-              <w:rPr>
-                <w:b/>
-              </w:rPr>
-              <w:t>Why</w:t>
-            </w:r>
-          </w:p>
-        </w:tc>
-      </w:tr>
-      <w:tr>
-        <w:tc>
-          <w:tcPr>
-            <w:tcW w:type="dxa" w:w="2880"/>
-          </w:tcPr>
-          <w:p>
-            <w:r>
-              <w:rPr>
-                <w:rFonts w:ascii="Consolas" w:hAnsi="Consolas"/>
-                <w:color w:val="B03060"/>
-                <w:sz w:val="19"/>
-              </w:rPr>
-              <w:t>getent passwd</w:t>
-            </w:r>
-          </w:p>
-        </w:tc>
-        <w:tc>
-          <w:tcPr>
-            <w:tcW w:type="dxa" w:w="2880"/>
-          </w:tcPr>
-          <w:p>
-            <w:r>
-              <w:rPr>
-                <w:rFonts w:ascii="Consolas" w:hAnsi="Consolas"/>
-                <w:color w:val="B03060"/>
-                <w:sz w:val="19"/>
-              </w:rPr>
-              <w:t>...:/home/devops_test:/bin/bash</w:t>
-            </w:r>
-          </w:p>
-        </w:tc>
-        <w:tc>
-          <w:tcPr>
-            <w:tcW w:type="dxa" w:w="2880"/>
-          </w:tcPr>
-          <w:p>
-            <w:r>
-              <w:rPr>
-                <w:rFonts w:ascii="Consolas" w:hAnsi="Consolas"/>
-                <w:color w:val="B03060"/>
-                <w:sz w:val="19"/>
-              </w:rPr>
-              <w:t>DSHELL=/bin/bash</w:t>
-            </w:r>
-            <w:r>
-              <w:t xml:space="preserve"> and </w:t>
-            </w:r>
-            <w:r>
-              <w:rPr>
-                <w:rFonts w:ascii="Consolas" w:hAnsi="Consolas"/>
-                <w:color w:val="B03060"/>
-                <w:sz w:val="19"/>
-              </w:rPr>
-              <w:t>DHOME=/home</w:t>
-            </w:r>
-            <w:r>
-              <w:t xml:space="preserve"> in </w:t>
-            </w:r>
-            <w:r>
-              <w:rPr>
-                <w:rFonts w:ascii="Consolas" w:hAnsi="Consolas"/>
-                <w:color w:val="B03060"/>
-                <w:sz w:val="19"/>
-              </w:rPr>
-              <w:t>/etc/adduser.conf</w:t>
-            </w:r>
-          </w:p>
-        </w:tc>
-      </w:tr>
-      <w:tr>
-        <w:tc>
-          <w:tcPr>
-            <w:tcW w:type="dxa" w:w="2880"/>
-          </w:tcPr>
-          <w:p>
-            <w:r>
-              <w:rPr>
-                <w:rFonts w:ascii="Consolas" w:hAnsi="Consolas"/>
-                <w:color w:val="B03060"/>
-                <w:sz w:val="19"/>
-              </w:rPr>
-              <w:t>ls -ld /home/devops_test</w:t>
-            </w:r>
-          </w:p>
-        </w:tc>
-        <w:tc>
-          <w:tcPr>
-            <w:tcW w:type="dxa" w:w="2880"/>
-          </w:tcPr>
-          <w:p>
-            <w:r>
-              <w:rPr>
-                <w:rFonts w:ascii="Consolas" w:hAnsi="Consolas"/>
-                <w:color w:val="B03060"/>
-                <w:sz w:val="19"/>
-              </w:rPr>
-              <w:t>drwxr-x---</w:t>
-            </w:r>
-            <w:r>
-              <w:t xml:space="preserve"> (0750)</w:t>
-            </w:r>
-          </w:p>
-        </w:tc>
-        <w:tc>
-          <w:tcPr>
-            <w:tcW w:type="dxa" w:w="2880"/>
-          </w:tcPr>
-          <w:p>
-            <w:r>
-              <w:rPr>
-                <w:rFonts w:ascii="Consolas" w:hAnsi="Consolas"/>
-                <w:color w:val="B03060"/>
-                <w:sz w:val="19"/>
-              </w:rPr>
-              <w:t>DIR_MODE=0750</w:t>
-            </w:r>
-            <w:r>
-              <w:t xml:space="preserve"> in the same file — not world readable</w:t>
-            </w:r>
-          </w:p>
-        </w:tc>
-      </w:tr>
-      <w:tr>
-        <w:tc>
-          <w:tcPr>
-            <w:tcW w:type="dxa" w:w="2880"/>
-          </w:tcPr>
-          <w:p>
-            <w:r>
-              <w:t>the home directory</w:t>
-            </w:r>
-          </w:p>
-        </w:tc>
-        <w:tc>
-          <w:tcPr>
-            <w:tcW w:type="dxa" w:w="2880"/>
-          </w:tcPr>
-          <w:p>
-            <w:r>
-              <w:rPr>
-                <w:rFonts w:ascii="Consolas" w:hAnsi="Consolas"/>
-                <w:color w:val="B03060"/>
-                <w:sz w:val="19"/>
-              </w:rPr>
-              <w:t>.bash_logout</w:t>
-            </w:r>
-            <w:r>
-              <w:t xml:space="preserve">, </w:t>
-            </w:r>
-            <w:r>
-              <w:rPr>
-                <w:rFonts w:ascii="Consolas" w:hAnsi="Consolas"/>
-                <w:color w:val="B03060"/>
-                <w:sz w:val="19"/>
-              </w:rPr>
-              <w:t>.bashrc</w:t>
-            </w:r>
-            <w:r>
-              <w:t xml:space="preserve">, </w:t>
-            </w:r>
-            <w:r>
-              <w:rPr>
-                <w:rFonts w:ascii="Consolas" w:hAnsi="Consolas"/>
-                <w:color w:val="B03060"/>
-                <w:sz w:val="19"/>
-              </w:rPr>
-              <w:t>.profile</w:t>
-            </w:r>
-          </w:p>
-        </w:tc>
-        <w:tc>
-          <w:tcPr>
-            <w:tcW w:type="dxa" w:w="2880"/>
-          </w:tcPr>
-          <w:p>
-            <w:r>
-              <w:t xml:space="preserve">copied from </w:t>
-            </w:r>
-            <w:r>
-              <w:rPr>
-                <w:rFonts w:ascii="Consolas" w:hAnsi="Consolas"/>
-                <w:color w:val="B03060"/>
-                <w:sz w:val="19"/>
-              </w:rPr>
-              <w:t>/etc/skel</w:t>
-            </w:r>
-            <w:r>
-              <w:t xml:space="preserve">, so they carry the </w:t>
-            </w:r>
-            <w:r>
-              <w:rPr>
-                <w:i/>
-              </w:rPr>
-              <w:t>package's</w:t>
-            </w:r>
-            <w:r>
-              <w:t xml:space="preserve"> dates, not today's</w:t>
-            </w:r>
-          </w:p>
-        </w:tc>
-      </w:tr>
-      <w:tr>
-        <w:tc>
-          <w:tcPr>
-            <w:tcW w:type="dxa" w:w="2880"/>
-          </w:tcPr>
-          <w:p>
-            <w:r>
-              <w:rPr>
-                <w:rFonts w:ascii="Consolas" w:hAnsi="Consolas"/>
-                <w:color w:val="B03060"/>
-                <w:sz w:val="19"/>
-              </w:rPr>
-              <w:t>passwd -S</w:t>
-            </w:r>
-          </w:p>
-        </w:tc>
-        <w:tc>
-          <w:tcPr>
-            <w:tcW w:type="dxa" w:w="2880"/>
-          </w:tcPr>
-          <w:p>
-            <w:r>
-              <w:rPr>
-                <w:rFonts w:ascii="Consolas" w:hAnsi="Consolas"/>
-                <w:color w:val="B03060"/>
-                <w:sz w:val="19"/>
-              </w:rPr>
-              <w:t>devops_test P ...</w:t>
-            </w:r>
-          </w:p>
-        </w:tc>
-        <w:tc>
-          <w:tcPr>
-            <w:tcW w:type="dxa" w:w="2880"/>
-          </w:tcPr>
-          <w:p>
-            <w:r>
-              <w:rPr>
-                <w:b/>
-              </w:rPr>
-              <w:t>`P`</w:t>
-            </w:r>
-            <w:r>
-              <w:t xml:space="preserve"> = a usable password is set</w:t>
-            </w:r>
-          </w:p>
-        </w:tc>
-      </w:tr>
-    </w:tbl>
-    <w:p/>
     <w:p>
       <w:r>
-        <w:t>If the account needed admin rights:</w:t>
+        <w:t>Checking what it actually built:</w:t>
       </w:r>
     </w:p>
     <w:p>
@@ -3615,56 +3380,243 @@
           <w:color w:val="1A1A1A"/>
           <w:sz w:val="17"/>
         </w:rPr>
-        <w:t>sudo usermod -aG sudo devops_test</w:t>
+        <w:t>root@usertest:/# id devops_test</w:t>
+      </w:r>
+      <w:r>
+        <w:rPr>
+          <w:rFonts w:ascii="Consolas" w:hAnsi="Consolas"/>
+          <w:color w:val="1A1A1A"/>
+          <w:sz w:val="17"/>
+        </w:rPr>
+        <w:br/>
+        <w:t>uid=1000(devops_test) gid=1000(devops_test) groups=1000(devops_test)</w:t>
+      </w:r>
+      <w:r>
+        <w:rPr>
+          <w:rFonts w:ascii="Consolas" w:hAnsi="Consolas"/>
+          <w:color w:val="1A1A1A"/>
+          <w:sz w:val="17"/>
+        </w:rPr>
+        <w:br/>
+        <w:t>root@usertest:/# getent passwd devops_test</w:t>
+      </w:r>
+      <w:r>
+        <w:rPr>
+          <w:rFonts w:ascii="Consolas" w:hAnsi="Consolas"/>
+          <w:color w:val="1A1A1A"/>
+          <w:sz w:val="17"/>
+        </w:rPr>
+        <w:br/>
+        <w:t>devops_test:x:1000:1000:DevOps Test User,,,:/home/devops_test:/bin/bash</w:t>
+      </w:r>
+      <w:r>
+        <w:rPr>
+          <w:rFonts w:ascii="Consolas" w:hAnsi="Consolas"/>
+          <w:color w:val="1A1A1A"/>
+          <w:sz w:val="17"/>
+        </w:rPr>
+        <w:br/>
+        <w:t>root@usertest:/# ls -la /home/devops_test</w:t>
+      </w:r>
+      <w:r>
+        <w:rPr>
+          <w:rFonts w:ascii="Consolas" w:hAnsi="Consolas"/>
+          <w:color w:val="1A1A1A"/>
+          <w:sz w:val="17"/>
+        </w:rPr>
+        <w:br/>
+        <w:t>total 20</w:t>
+      </w:r>
+      <w:r>
+        <w:rPr>
+          <w:rFonts w:ascii="Consolas" w:hAnsi="Consolas"/>
+          <w:color w:val="1A1A1A"/>
+          <w:sz w:val="17"/>
+        </w:rPr>
+        <w:br/>
+        <w:t>drwxr-x--- 2 devops_test devops_test 4096 Sep  3 11:16 .</w:t>
+      </w:r>
+      <w:r>
+        <w:rPr>
+          <w:rFonts w:ascii="Consolas" w:hAnsi="Consolas"/>
+          <w:color w:val="1A1A1A"/>
+          <w:sz w:val="17"/>
+        </w:rPr>
+        <w:br/>
+        <w:t>drwxr-xr-x 1 root        root        4096 Sep  3 11:16 ..</w:t>
+      </w:r>
+      <w:r>
+        <w:rPr>
+          <w:rFonts w:ascii="Consolas" w:hAnsi="Consolas"/>
+          <w:color w:val="1A1A1A"/>
+          <w:sz w:val="17"/>
+        </w:rPr>
+        <w:br/>
+        <w:t>-rw-r--r-- 1 devops_test devops_test  220 Sep  3 11:16 .bash_logout</w:t>
+      </w:r>
+      <w:r>
+        <w:rPr>
+          <w:rFonts w:ascii="Consolas" w:hAnsi="Consolas"/>
+          <w:color w:val="1A1A1A"/>
+          <w:sz w:val="17"/>
+        </w:rPr>
+        <w:br/>
+        <w:t>-rw-r--r-- 1 devops_test devops_test 3771 Sep  3 11:16 .bashrc</w:t>
+      </w:r>
+      <w:r>
+        <w:rPr>
+          <w:rFonts w:ascii="Consolas" w:hAnsi="Consolas"/>
+          <w:color w:val="1A1A1A"/>
+          <w:sz w:val="17"/>
+        </w:rPr>
+        <w:br/>
+        <w:t>-rw-r--r-- 1 devops_test devops_test  807 Sep  3 11:16 .profile</w:t>
+      </w:r>
+      <w:r>
+        <w:rPr>
+          <w:rFonts w:ascii="Consolas" w:hAnsi="Consolas"/>
+          <w:color w:val="1A1A1A"/>
+          <w:sz w:val="17"/>
+        </w:rPr>
+        <w:br/>
+        <w:t>root@usertest:/# passwd -S devops_test</w:t>
+      </w:r>
+      <w:r>
+        <w:rPr>
+          <w:rFonts w:ascii="Consolas" w:hAnsi="Consolas"/>
+          <w:color w:val="1A1A1A"/>
+          <w:sz w:val="17"/>
+        </w:rPr>
+        <w:br/>
+        <w:t>devops_test P 09/03/2026 0 99999 7 -1</w:t>
+      </w:r>
+      <w:r>
+        <w:rPr>
+          <w:rFonts w:ascii="Consolas" w:hAnsi="Consolas"/>
+          <w:color w:val="1A1A1A"/>
+          <w:sz w:val="17"/>
+        </w:rPr>
+        <w:br/>
+        <w:t>root@usertest:/# getent group devops_test</w:t>
+      </w:r>
+      <w:r>
+        <w:rPr>
+          <w:rFonts w:ascii="Consolas" w:hAnsi="Consolas"/>
+          <w:color w:val="1A1A1A"/>
+          <w:sz w:val="17"/>
+        </w:rPr>
+        <w:br/>
+        <w:t>devops_test:x:1000:</w:t>
       </w:r>
     </w:p>
     <w:p>
       <w:r>
-        <w:t xml:space="preserve">The </w:t>
-      </w:r>
-      <w:r>
-        <w:rPr>
-          <w:rFonts w:ascii="Consolas" w:hAnsi="Consolas"/>
-          <w:color w:val="B03060"/>
-          <w:sz w:val="19"/>
-        </w:rPr>
-        <w:t>-a</w:t>
-      </w:r>
-      <w:r>
-        <w:t xml:space="preserve"> there is not optional. </w:t>
-      </w:r>
-      <w:r>
-        <w:rPr>
-          <w:rFonts w:ascii="Consolas" w:hAnsi="Consolas"/>
-          <w:color w:val="B03060"/>
-          <w:sz w:val="19"/>
-        </w:rPr>
-        <w:t>usermod -G sudo devops_test</w:t>
-      </w:r>
-      <w:r>
-        <w:t xml:space="preserve"> without it would </w:t>
-      </w:r>
-      <w:r>
-        <w:rPr>
-          <w:i/>
-        </w:rPr>
-        <w:t>replace</w:t>
-      </w:r>
-      <w:r>
-        <w:t xml:space="preserve"> the user's supplementary groups instead of adding to them, which is a genuinely nasty way to lock someone out of things.</w:t>
+        <w:t>Four things to read out of that:</w:t>
       </w:r>
     </w:p>
     <w:p>
       <w:pPr>
-        <w:pStyle w:val="Heading3"/>
+        <w:pStyle w:val="ListBullet"/>
       </w:pPr>
       <w:r>
-        <w:t>What plain useradd does instead</w:t>
+        <w:t xml:space="preserve">The shell is </w:t>
+      </w:r>
+      <w:r>
+        <w:rPr>
+          <w:b/>
+        </w:rPr>
+        <w:t>`/bin/bash`</w:t>
+      </w:r>
+      <w:r>
+        <w:t>.</w:t>
       </w:r>
     </w:p>
     <w:p>
-      <w:r>
-        <w:t>The contrast is the point of this task, so the same thing with no flags:</w:t>
+      <w:pPr>
+        <w:pStyle w:val="ListBullet"/>
+      </w:pPr>
+      <w:r>
+        <w:t xml:space="preserve">The home directory mode is </w:t>
+      </w:r>
+      <w:r>
+        <w:rPr>
+          <w:b/>
+        </w:rPr>
+        <w:t>`drwxr-x---`</w:t>
+      </w:r>
+      <w:r>
+        <w:t xml:space="preserve">, i.e. </w:t>
+      </w:r>
+      <w:r>
+        <w:rPr>
+          <w:rFonts w:ascii="Consolas" w:hAnsi="Consolas"/>
+          <w:color w:val="B03060"/>
+          <w:sz w:val="19"/>
+        </w:rPr>
+        <w:t>0750</w:t>
+      </w:r>
+      <w:r>
+        <w:t xml:space="preserve"> — group-readable, not world-readable.</w:t>
+      </w:r>
+    </w:p>
+    <w:p>
+      <w:pPr>
+        <w:pStyle w:val="ListBullet"/>
+      </w:pPr>
+      <w:r>
+        <w:t xml:space="preserve">The three dotfiles came straight from </w:t>
+      </w:r>
+      <w:r>
+        <w:rPr>
+          <w:rFonts w:ascii="Consolas" w:hAnsi="Consolas"/>
+          <w:color w:val="B03060"/>
+          <w:sz w:val="19"/>
+        </w:rPr>
+        <w:t>/etc/skel</w:t>
+      </w:r>
+      <w:r>
+        <w:t>.</w:t>
+      </w:r>
+    </w:p>
+    <w:p>
+      <w:pPr>
+        <w:pStyle w:val="ListBullet"/>
+      </w:pPr>
+      <w:r>
+        <w:rPr>
+          <w:rFonts w:ascii="Consolas" w:hAnsi="Consolas"/>
+          <w:color w:val="B03060"/>
+          <w:sz w:val="19"/>
+        </w:rPr>
+        <w:t>passwd -S</w:t>
+      </w:r>
+      <w:r>
+        <w:t xml:space="preserve"> reports </w:t>
+      </w:r>
+      <w:r>
+        <w:rPr>
+          <w:b/>
+        </w:rPr>
+        <w:t>`P`</w:t>
+      </w:r>
+      <w:r>
+        <w:t>, meaning a usable password is set.</w:t>
+      </w:r>
+    </w:p>
+    <w:p>
+      <w:r>
+        <w:t xml:space="preserve">None of those are accidents. They come from </w:t>
+      </w:r>
+      <w:r>
+        <w:rPr>
+          <w:rFonts w:ascii="Consolas" w:hAnsi="Consolas"/>
+          <w:color w:val="B03060"/>
+          <w:sz w:val="19"/>
+        </w:rPr>
+        <w:t>/etc/adduser.conf</w:t>
+      </w:r>
+      <w:r>
+        <w:t>:</w:t>
       </w:r>
     </w:p>
     <w:p>
@@ -3678,7 +3630,7 @@
           <w:color w:val="1A1A1A"/>
           <w:sz w:val="17"/>
         </w:rPr>
-        <w:t>sudo useradd useradd_test</w:t>
+        <w:t>root@usertest:/# grep -E "^(DSHELL|DHOME|DIR_MODE)" /etc/adduser.conf</w:t>
       </w:r>
       <w:r>
         <w:rPr>
@@ -3687,7 +3639,7 @@
           <w:sz w:val="17"/>
         </w:rPr>
         <w:br/>
-        <w:t>getent passwd useradd_test     # useradd_test:x:...::/home/useradd_test:/bin/sh</w:t>
+        <w:t>DSHELL=/bin/bash</w:t>
       </w:r>
       <w:r>
         <w:rPr>
@@ -3696,7 +3648,7 @@
           <w:sz w:val="17"/>
         </w:rPr>
         <w:br/>
-        <w:t>ls -ld /home/useradd_test      # No such file or directory</w:t>
+        <w:t>DHOME=/home</w:t>
       </w:r>
       <w:r>
         <w:rPr>
@@ -3705,159 +3657,12 @@
           <w:sz w:val="17"/>
         </w:rPr>
         <w:br/>
-        <w:t>sudo passwd -S useradd_test    # useradd_test L ...</w:t>
+        <w:t>DIR_MODE=0750</w:t>
       </w:r>
     </w:p>
     <w:p>
       <w:r>
-        <w:t xml:space="preserve">Three problems in one go, and they follow directly from the config files I </w:t>
-      </w:r>
-      <w:r>
-        <w:rPr>
-          <w:i/>
-        </w:rPr>
-        <w:t>did</w:t>
-      </w:r>
-      <w:r>
-        <w:t xml:space="preserve"> verify above:</w:t>
-      </w:r>
-    </w:p>
-    <w:p>
-      <w:pPr>
-        <w:pStyle w:val="ListNumber"/>
-      </w:pPr>
-      <w:r>
-        <w:t xml:space="preserve">The passwd entry claims a home at </w:t>
-      </w:r>
-      <w:r>
-        <w:rPr>
-          <w:rFonts w:ascii="Consolas" w:hAnsi="Consolas"/>
-          <w:color w:val="B03060"/>
-          <w:sz w:val="19"/>
-        </w:rPr>
-        <w:t>/home/useradd_test</w:t>
-      </w:r>
-      <w:r>
-        <w:t xml:space="preserve"> that was </w:t>
-      </w:r>
-      <w:r>
-        <w:rPr>
-          <w:b/>
-        </w:rPr>
-        <w:t>never created</w:t>
-      </w:r>
-      <w:r>
-        <w:t xml:space="preserve"> — </w:t>
-      </w:r>
-      <w:r>
-        <w:rPr>
-          <w:rFonts w:ascii="Consolas" w:hAnsi="Consolas"/>
-          <w:color w:val="B03060"/>
-          <w:sz w:val="19"/>
-        </w:rPr>
-        <w:t>useradd</w:t>
-      </w:r>
-      <w:r>
-        <w:t xml:space="preserve"> only creates it with </w:t>
-      </w:r>
-      <w:r>
-        <w:rPr>
-          <w:rFonts w:ascii="Consolas" w:hAnsi="Consolas"/>
-          <w:color w:val="B03060"/>
-          <w:sz w:val="19"/>
-        </w:rPr>
-        <w:t>-m</w:t>
-      </w:r>
-      <w:r>
-        <w:t>.</w:t>
-      </w:r>
-    </w:p>
-    <w:p>
-      <w:pPr>
-        <w:pStyle w:val="ListNumber"/>
-      </w:pPr>
-      <w:r>
-        <w:t xml:space="preserve">The shell is </w:t>
-      </w:r>
-      <w:r>
-        <w:rPr>
-          <w:b/>
-        </w:rPr>
-        <w:t>`/bin/sh`</w:t>
-      </w:r>
-      <w:r>
-        <w:t xml:space="preserve">, because </w:t>
-      </w:r>
-      <w:r>
-        <w:rPr>
-          <w:rFonts w:ascii="Consolas" w:hAnsi="Consolas"/>
-          <w:color w:val="B03060"/>
-          <w:sz w:val="19"/>
-        </w:rPr>
-        <w:t>/etc/default/useradd</w:t>
-      </w:r>
-      <w:r>
-        <w:t xml:space="preserve"> says </w:t>
-      </w:r>
-      <w:r>
-        <w:rPr>
-          <w:rFonts w:ascii="Consolas" w:hAnsi="Consolas"/>
-          <w:color w:val="B03060"/>
-          <w:sz w:val="19"/>
-        </w:rPr>
-        <w:t>SHELL=/bin/sh</w:t>
-      </w:r>
-      <w:r>
-        <w:t>. That is dash on Ubuntu: no history, no tab completion, no prompt customisation.</w:t>
-      </w:r>
-    </w:p>
-    <w:p>
-      <w:pPr>
-        <w:pStyle w:val="ListNumber"/>
-      </w:pPr>
-      <w:r>
-        <w:t xml:space="preserve">The password status is </w:t>
-      </w:r>
-      <w:r>
-        <w:rPr>
-          <w:b/>
-        </w:rPr>
-        <w:t>`L`</w:t>
-      </w:r>
-      <w:r>
-        <w:t>, locked, so the account cannot log in at all.</w:t>
-      </w:r>
-    </w:p>
-    <w:p>
-      <w:r>
-        <w:t xml:space="preserve">The account exists but is useless until you fix all three. That is exactly why </w:t>
-      </w:r>
-      <w:r>
-        <w:rPr>
-          <w:rFonts w:ascii="Consolas" w:hAnsi="Consolas"/>
-          <w:color w:val="B03060"/>
-          <w:sz w:val="19"/>
-        </w:rPr>
-        <w:t>adduser</w:t>
-      </w:r>
-      <w:r>
-        <w:t xml:space="preserve"> is the recommended command for adding a person by hand.</w:t>
-      </w:r>
-    </w:p>
-    <w:p>
-      <w:r>
-        <w:t xml:space="preserve">The </w:t>
-      </w:r>
-      <w:r>
-        <w:rPr>
-          <w:rFonts w:ascii="Consolas" w:hAnsi="Consolas"/>
-          <w:color w:val="B03060"/>
-          <w:sz w:val="19"/>
-        </w:rPr>
-        <w:t>useradd</w:t>
-      </w:r>
-      <w:r>
-        <w:t xml:space="preserve"> form that actually works, which is what belongs in a script or a Dockerfile:</w:t>
+        <w:t>And logging in works:</w:t>
       </w:r>
     </w:p>
     <w:p>
@@ -3871,7 +3676,7 @@
           <w:color w:val="1A1A1A"/>
           <w:sz w:val="17"/>
         </w:rPr>
-        <w:t>sudo useradd -m -d /home/devops_test -s /bin/bash -c "DevOps Test User" devops_test</w:t>
+        <w:t>root@usertest:/# su - devops_test -c "pwd; whoami; echo \$SHELL"</w:t>
       </w:r>
       <w:r>
         <w:rPr>
@@ -3880,78 +3685,35 @@
           <w:sz w:val="17"/>
         </w:rPr>
         <w:br/>
-        <w:t>sudo passwd devops_test</w:t>
+        <w:t>/home/devops_test</w:t>
+      </w:r>
+      <w:r>
+        <w:rPr>
+          <w:rFonts w:ascii="Consolas" w:hAnsi="Consolas"/>
+          <w:color w:val="1A1A1A"/>
+          <w:sz w:val="17"/>
+        </w:rPr>
+        <w:br/>
+        <w:t>devops_test</w:t>
+      </w:r>
+      <w:r>
+        <w:rPr>
+          <w:rFonts w:ascii="Consolas" w:hAnsi="Consolas"/>
+          <w:color w:val="1A1A1A"/>
+          <w:sz w:val="17"/>
+        </w:rPr>
+        <w:br/>
+        <w:t>/bin/bash</w:t>
       </w:r>
     </w:p>
     <w:p>
       <w:r>
-        <w:rPr>
-          <w:rFonts w:ascii="Consolas" w:hAnsi="Consolas"/>
-          <w:color w:val="B03060"/>
-          <w:sz w:val="19"/>
-        </w:rPr>
-        <w:t>-m</w:t>
-      </w:r>
-      <w:r>
-        <w:t xml:space="preserve"> create the home directory and copy skel, </w:t>
-      </w:r>
-      <w:r>
-        <w:rPr>
-          <w:rFonts w:ascii="Consolas" w:hAnsi="Consolas"/>
-          <w:color w:val="B03060"/>
-          <w:sz w:val="19"/>
-        </w:rPr>
-        <w:t>-d</w:t>
-      </w:r>
-      <w:r>
-        <w:t xml:space="preserve"> where it goes, </w:t>
-      </w:r>
-      <w:r>
-        <w:rPr>
-          <w:rFonts w:ascii="Consolas" w:hAnsi="Consolas"/>
-          <w:color w:val="B03060"/>
-          <w:sz w:val="19"/>
-        </w:rPr>
-        <w:t>-s</w:t>
-      </w:r>
-      <w:r>
-        <w:t xml:space="preserve"> login shell, </w:t>
-      </w:r>
-      <w:r>
-        <w:rPr>
-          <w:rFonts w:ascii="Consolas" w:hAnsi="Consolas"/>
-          <w:color w:val="B03060"/>
-          <w:sz w:val="19"/>
-        </w:rPr>
-        <w:t>-c</w:t>
-      </w:r>
-      <w:r>
-        <w:t xml:space="preserve"> the comment/GECOS field.</w:t>
+        <w:t>Landed in the right home directory, as the right user, with the right shell.</w:t>
       </w:r>
     </w:p>
     <w:p>
       <w:r>
-        <w:t xml:space="preserve">Worth noting I </w:t>
-      </w:r>
-      <w:r>
-        <w:rPr>
-          <w:i/>
-        </w:rPr>
-        <w:t>have</w:t>
-      </w:r>
-      <w:r>
-        <w:t xml:space="preserve"> used the </w:t>
-      </w:r>
-      <w:r>
-        <w:rPr>
-          <w:rFonts w:ascii="Consolas" w:hAnsi="Consolas"/>
-          <w:color w:val="B03060"/>
-          <w:sz w:val="19"/>
-        </w:rPr>
-        <w:t>useradd</w:t>
-      </w:r>
-      <w:r>
-        <w:t xml:space="preserve"> family non-interactively elsewhere in this homework — the multi-stage Dockerfile in Assignment 6 contains:</w:t>
+        <w:t>If the account needed admin rights:</w:t>
       </w:r>
     </w:p>
     <w:p>
@@ -3965,12 +3727,30 @@
           <w:color w:val="1A1A1A"/>
           <w:sz w:val="17"/>
         </w:rPr>
-        <w:t>RUN adduser -D -u 10001 appuser</w:t>
+        <w:t>root@usertest:/# usermod -aG sudo devops_test</w:t>
+      </w:r>
+      <w:r>
+        <w:rPr>
+          <w:rFonts w:ascii="Consolas" w:hAnsi="Consolas"/>
+          <w:color w:val="1A1A1A"/>
+          <w:sz w:val="17"/>
+        </w:rPr>
+        <w:br/>
+        <w:t>root@usertest:/# id devops_test</w:t>
+      </w:r>
+      <w:r>
+        <w:rPr>
+          <w:rFonts w:ascii="Consolas" w:hAnsi="Consolas"/>
+          <w:color w:val="1A1A1A"/>
+          <w:sz w:val="17"/>
+        </w:rPr>
+        <w:br/>
+        <w:t>uid=1000(devops_test) gid=1000(devops_test) groups=1000(devops_test),27(sudo)</w:t>
       </w:r>
     </w:p>
     <w:p>
       <w:r>
-        <w:t xml:space="preserve">and </w:t>
+        <w:t xml:space="preserve">The </w:t>
       </w:r>
       <w:r>
         <w:rPr>
@@ -3978,10 +3758,10 @@
           <w:color w:val="B03060"/>
           <w:sz w:val="19"/>
         </w:rPr>
-        <w:t>docker exec hello-multistage id</w:t>
-      </w:r>
-      <w:r>
-        <w:t xml:space="preserve"> really did return </w:t>
+        <w:t>-a</w:t>
+      </w:r>
+      <w:r>
+        <w:t xml:space="preserve"> is not optional. </w:t>
       </w:r>
       <w:r>
         <w:rPr>
@@ -3989,32 +3769,19 @@
           <w:color w:val="B03060"/>
           <w:sz w:val="19"/>
         </w:rPr>
-        <w:t>uid=10001(appuser) gid=10001(appuser)</w:t>
-      </w:r>
-      <w:r>
-        <w:t xml:space="preserve">. That is busybox's </w:t>
-      </w:r>
-      <w:r>
-        <w:rPr>
-          <w:rFonts w:ascii="Consolas" w:hAnsi="Consolas"/>
-          <w:color w:val="B03060"/>
-          <w:sz w:val="19"/>
-        </w:rPr>
-        <w:t>adduser</w:t>
-      </w:r>
-      <w:r>
-        <w:t xml:space="preserve"> inside Alpine rather than Debian's Perl one, and </w:t>
-      </w:r>
-      <w:r>
-        <w:rPr>
-          <w:rFonts w:ascii="Consolas" w:hAnsi="Consolas"/>
-          <w:color w:val="B03060"/>
-          <w:sz w:val="19"/>
-        </w:rPr>
-        <w:t>-D</w:t>
-      </w:r>
-      <w:r>
-        <w:t xml:space="preserve"> means "no password". It is the same idea as the automation argument above: explicit flags, no prompts, reproducible.</w:t>
+        <w:t>usermod -G sudo devops_test</w:t>
+      </w:r>
+      <w:r>
+        <w:t xml:space="preserve"> without it would </w:t>
+      </w:r>
+      <w:r>
+        <w:rPr>
+          <w:i/>
+        </w:rPr>
+        <w:t>replace</w:t>
+      </w:r>
+      <w:r>
+        <w:t xml:space="preserve"> the user's supplementary groups rather than add to them, which is a genuinely nasty way to lock someone out of things.</w:t>
       </w:r>
     </w:p>
     <w:p>
@@ -4022,7 +3789,12 @@
         <w:pStyle w:val="Heading3"/>
       </w:pPr>
       <w:r>
-        <w:t>Cleanup</w:t>
+        <w:t>What plain useradd does instead</w:t>
+      </w:r>
+    </w:p>
+    <w:p>
+      <w:r>
+        <w:t>The contrast is the whole point of this task, so the same thing with no flags at all:</w:t>
       </w:r>
     </w:p>
     <w:p>
@@ -4036,7 +3808,7 @@
           <w:color w:val="1A1A1A"/>
           <w:sz w:val="17"/>
         </w:rPr>
-        <w:t>sudo deluser --remove-home devops_test</w:t>
+        <w:t>root@usertest:/# useradd useradd_test</w:t>
       </w:r>
       <w:r>
         <w:rPr>
@@ -4045,7 +3817,7 @@
           <w:sz w:val="17"/>
         </w:rPr>
         <w:br/>
-        <w:t>sudo userdel -r useradd_test</w:t>
+        <w:t>root@usertest:/# getent passwd useradd_test</w:t>
       </w:r>
       <w:r>
         <w:rPr>
@@ -4054,20 +3826,76 @@
           <w:sz w:val="17"/>
         </w:rPr>
         <w:br/>
-        <w:t>getent passwd devops_test useradd_test   # empty output, exit status 2 = neither exists</w:t>
+        <w:t>useradd_test:x:1001:1001::/home/useradd_test:/bin/sh</w:t>
+      </w:r>
+      <w:r>
+        <w:rPr>
+          <w:rFonts w:ascii="Consolas" w:hAnsi="Consolas"/>
+          <w:color w:val="1A1A1A"/>
+          <w:sz w:val="17"/>
+        </w:rPr>
+        <w:br/>
+        <w:t>root@usertest:/# ls -ld /home/useradd_test</w:t>
+      </w:r>
+      <w:r>
+        <w:rPr>
+          <w:rFonts w:ascii="Consolas" w:hAnsi="Consolas"/>
+          <w:color w:val="1A1A1A"/>
+          <w:sz w:val="17"/>
+        </w:rPr>
+        <w:br/>
+        <w:t>ls: cannot access '/home/useradd_test': No such file or directory</w:t>
+      </w:r>
+      <w:r>
+        <w:rPr>
+          <w:rFonts w:ascii="Consolas" w:hAnsi="Consolas"/>
+          <w:color w:val="1A1A1A"/>
+          <w:sz w:val="17"/>
+        </w:rPr>
+        <w:br/>
+        <w:t>root@usertest:/# passwd -S useradd_test</w:t>
+      </w:r>
+      <w:r>
+        <w:rPr>
+          <w:rFonts w:ascii="Consolas" w:hAnsi="Consolas"/>
+          <w:color w:val="1A1A1A"/>
+          <w:sz w:val="17"/>
+        </w:rPr>
+        <w:br/>
+        <w:t>useradd_test L 09/03/2026 0 99999 7 -1</w:t>
       </w:r>
     </w:p>
     <w:p>
       <w:r>
+        <w:t>Three problems in one command, and they line up exactly with the config files:</w:t>
+      </w:r>
+    </w:p>
+    <w:p>
+      <w:pPr>
+        <w:pStyle w:val="ListNumber"/>
+      </w:pPr>
+      <w:r>
+        <w:t xml:space="preserve">The passwd entry </w:t>
+      </w:r>
+      <w:r>
+        <w:rPr>
+          <w:b/>
+        </w:rPr>
+        <w:t>claims</w:t>
+      </w:r>
+      <w:r>
+        <w:t xml:space="preserve"> a home at </w:t>
+      </w:r>
+      <w:r>
         <w:rPr>
           <w:rFonts w:ascii="Consolas" w:hAnsi="Consolas"/>
           <w:color w:val="B03060"/>
           <w:sz w:val="19"/>
         </w:rPr>
-        <w:t>userdel -r</w:t>
-      </w:r>
-      <w:r>
-        <w:t xml:space="preserve"> will complain that </w:t>
+        <w:t>/home/useradd_test</w:t>
+      </w:r>
+      <w:r>
+        <w:t xml:space="preserve"> that was never created. </w:t>
       </w:r>
       <w:r>
         <w:rPr>
@@ -4075,10 +3903,622 @@
           <w:color w:val="B03060"/>
           <w:sz w:val="19"/>
         </w:rPr>
+        <w:t>useradd</w:t>
+      </w:r>
+      <w:r>
+        <w:t xml:space="preserve"> only creates it with </w:t>
+      </w:r>
+      <w:r>
+        <w:rPr>
+          <w:rFonts w:ascii="Consolas" w:hAnsi="Consolas"/>
+          <w:color w:val="B03060"/>
+          <w:sz w:val="19"/>
+        </w:rPr>
+        <w:t>-m</w:t>
+      </w:r>
+      <w:r>
+        <w:t>.</w:t>
+      </w:r>
+    </w:p>
+    <w:p>
+      <w:pPr>
+        <w:pStyle w:val="ListNumber"/>
+      </w:pPr>
+      <w:r>
+        <w:t xml:space="preserve">The shell is </w:t>
+      </w:r>
+      <w:r>
+        <w:rPr>
+          <w:b/>
+        </w:rPr>
+        <w:t>`/bin/sh`</w:t>
+      </w:r>
+      <w:r>
+        <w:t xml:space="preserve">, which is dash on Ubuntu — no history, no tab completion, no prompt customisation. That comes from </w:t>
+      </w:r>
+      <w:r>
+        <w:rPr>
+          <w:rFonts w:ascii="Consolas" w:hAnsi="Consolas"/>
+          <w:color w:val="B03060"/>
+          <w:sz w:val="19"/>
+        </w:rPr>
+        <w:t>/etc/default/useradd</w:t>
+      </w:r>
+      <w:r>
+        <w:t>:</w:t>
+      </w:r>
+    </w:p>
+    <w:p>
+      <w:pPr>
+        <w:spacing w:before="120" w:after="120" w:line="240" w:lineRule="auto"/>
+        <w:ind w:left="360"/>
+      </w:pPr>
+      <w:r>
+        <w:rPr>
+          <w:rFonts w:ascii="Consolas" w:hAnsi="Consolas"/>
+          <w:color w:val="1A1A1A"/>
+          <w:sz w:val="17"/>
+        </w:rPr>
+        <w:t>root@usertest:/# grep -E "^SHELL" /etc/default/useradd</w:t>
+      </w:r>
+      <w:r>
+        <w:rPr>
+          <w:rFonts w:ascii="Consolas" w:hAnsi="Consolas"/>
+          <w:color w:val="1A1A1A"/>
+          <w:sz w:val="17"/>
+        </w:rPr>
+        <w:br/>
+        <w:t>SHELL=/bin/sh</w:t>
+      </w:r>
+    </w:p>
+    <w:p>
+      <w:pPr>
+        <w:pStyle w:val="ListNumber"/>
+      </w:pPr>
+      <w:r>
+        <w:t xml:space="preserve">The password status is </w:t>
+      </w:r>
+      <w:r>
+        <w:rPr>
+          <w:b/>
+        </w:rPr>
+        <w:t>`L`</w:t>
+      </w:r>
+      <w:r>
+        <w:t>, locked. The account cannot log in at all.</w:t>
+      </w:r>
+    </w:p>
+    <w:p>
+      <w:r>
+        <w:t>The consequence is visible immediately:</w:t>
+      </w:r>
+    </w:p>
+    <w:p>
+      <w:pPr>
+        <w:spacing w:before="120" w:after="120" w:line="240" w:lineRule="auto"/>
+        <w:ind w:left="360"/>
+      </w:pPr>
+      <w:r>
+        <w:rPr>
+          <w:rFonts w:ascii="Consolas" w:hAnsi="Consolas"/>
+          <w:color w:val="1A1A1A"/>
+          <w:sz w:val="17"/>
+        </w:rPr>
+        <w:t>root@usertest:/# su - useradd_test -c "pwd; whoami"</w:t>
+      </w:r>
+      <w:r>
+        <w:rPr>
+          <w:rFonts w:ascii="Consolas" w:hAnsi="Consolas"/>
+          <w:color w:val="1A1A1A"/>
+          <w:sz w:val="17"/>
+        </w:rPr>
+        <w:br/>
+        <w:t>su: warning: cannot change directory to /home/useradd_test: No such file or directory</w:t>
+      </w:r>
+      <w:r>
+        <w:rPr>
+          <w:rFonts w:ascii="Consolas" w:hAnsi="Consolas"/>
+          <w:color w:val="1A1A1A"/>
+          <w:sz w:val="17"/>
+        </w:rPr>
+        <w:br/>
+        <w:t>/</w:t>
+      </w:r>
+      <w:r>
+        <w:rPr>
+          <w:rFonts w:ascii="Consolas" w:hAnsi="Consolas"/>
+          <w:color w:val="1A1A1A"/>
+          <w:sz w:val="17"/>
+        </w:rPr>
+        <w:br/>
         <w:t>useradd_test</w:t>
       </w:r>
-      <w:r>
-        <w:t>'s home directory was not found, which tracks with it never having been created in the first place.</w:t>
+    </w:p>
+    <w:p>
+      <w:r>
+        <w:t xml:space="preserve">The user exists, but they are dumped in </w:t>
+      </w:r>
+      <w:r>
+        <w:rPr>
+          <w:rFonts w:ascii="Consolas" w:hAnsi="Consolas"/>
+          <w:color w:val="B03060"/>
+          <w:sz w:val="19"/>
+        </w:rPr>
+        <w:t>/</w:t>
+      </w:r>
+      <w:r>
+        <w:t xml:space="preserve"> with a warning, on a dash shell, with a locked password. That is the account you get from bare </w:t>
+      </w:r>
+      <w:r>
+        <w:rPr>
+          <w:rFonts w:ascii="Consolas" w:hAnsi="Consolas"/>
+          <w:color w:val="B03060"/>
+          <w:sz w:val="19"/>
+        </w:rPr>
+        <w:t>useradd</w:t>
+      </w:r>
+      <w:r>
+        <w:t xml:space="preserve"> on Ubuntu, and it is exactly why </w:t>
+      </w:r>
+      <w:r>
+        <w:rPr>
+          <w:rFonts w:ascii="Consolas" w:hAnsi="Consolas"/>
+          <w:color w:val="B03060"/>
+          <w:sz w:val="19"/>
+        </w:rPr>
+        <w:t>adduser</w:t>
+      </w:r>
+      <w:r>
+        <w:t xml:space="preserve"> is the one to reach for when adding a person by hand.</w:t>
+      </w:r>
+    </w:p>
+    <w:p>
+      <w:r>
+        <w:t xml:space="preserve">The </w:t>
+      </w:r>
+      <w:r>
+        <w:rPr>
+          <w:rFonts w:ascii="Consolas" w:hAnsi="Consolas"/>
+          <w:color w:val="B03060"/>
+          <w:sz w:val="19"/>
+        </w:rPr>
+        <w:t>useradd</w:t>
+      </w:r>
+      <w:r>
+        <w:t xml:space="preserve"> form that actually works, which is what belongs in a script or a Dockerfile:</w:t>
+      </w:r>
+    </w:p>
+    <w:p>
+      <w:pPr>
+        <w:spacing w:before="120" w:after="120" w:line="240" w:lineRule="auto"/>
+        <w:ind w:left="360"/>
+      </w:pPr>
+      <w:r>
+        <w:rPr>
+          <w:rFonts w:ascii="Consolas" w:hAnsi="Consolas"/>
+          <w:color w:val="1A1A1A"/>
+          <w:sz w:val="17"/>
+        </w:rPr>
+        <w:t>useradd -m -d /home/devops_test -s /bin/bash -c "DevOps Test User" devops_test</w:t>
+      </w:r>
+      <w:r>
+        <w:rPr>
+          <w:rFonts w:ascii="Consolas" w:hAnsi="Consolas"/>
+          <w:color w:val="1A1A1A"/>
+          <w:sz w:val="17"/>
+        </w:rPr>
+        <w:br/>
+        <w:t>passwd devops_test</w:t>
+      </w:r>
+    </w:p>
+    <w:p>
+      <w:r>
+        <w:rPr>
+          <w:rFonts w:ascii="Consolas" w:hAnsi="Consolas"/>
+          <w:color w:val="B03060"/>
+          <w:sz w:val="19"/>
+        </w:rPr>
+        <w:t>-m</w:t>
+      </w:r>
+      <w:r>
+        <w:t xml:space="preserve"> create the home directory and copy skel, </w:t>
+      </w:r>
+      <w:r>
+        <w:rPr>
+          <w:rFonts w:ascii="Consolas" w:hAnsi="Consolas"/>
+          <w:color w:val="B03060"/>
+          <w:sz w:val="19"/>
+        </w:rPr>
+        <w:t>-d</w:t>
+      </w:r>
+      <w:r>
+        <w:t xml:space="preserve"> where it goes, </w:t>
+      </w:r>
+      <w:r>
+        <w:rPr>
+          <w:rFonts w:ascii="Consolas" w:hAnsi="Consolas"/>
+          <w:color w:val="B03060"/>
+          <w:sz w:val="19"/>
+        </w:rPr>
+        <w:t>-s</w:t>
+      </w:r>
+      <w:r>
+        <w:t xml:space="preserve"> login shell, </w:t>
+      </w:r>
+      <w:r>
+        <w:rPr>
+          <w:rFonts w:ascii="Consolas" w:hAnsi="Consolas"/>
+          <w:color w:val="B03060"/>
+          <w:sz w:val="19"/>
+        </w:rPr>
+        <w:t>-c</w:t>
+      </w:r>
+      <w:r>
+        <w:t xml:space="preserve"> the comment/GECOS field.</w:t>
+      </w:r>
+    </w:p>
+    <w:p>
+      <w:r>
+        <w:t>That automation argument is not hypothetical — the multi-stage Dockerfile in Assignment 6 uses exactly this pattern:</w:t>
+      </w:r>
+    </w:p>
+    <w:p>
+      <w:pPr>
+        <w:spacing w:before="120" w:after="120" w:line="240" w:lineRule="auto"/>
+        <w:ind w:left="360"/>
+      </w:pPr>
+      <w:r>
+        <w:rPr>
+          <w:rFonts w:ascii="Consolas" w:hAnsi="Consolas"/>
+          <w:color w:val="1A1A1A"/>
+          <w:sz w:val="17"/>
+        </w:rPr>
+        <w:t>RUN adduser -D -u 10001 appuser</w:t>
+      </w:r>
+    </w:p>
+    <w:p>
+      <w:r>
+        <w:t xml:space="preserve">and </w:t>
+      </w:r>
+      <w:r>
+        <w:rPr>
+          <w:rFonts w:ascii="Consolas" w:hAnsi="Consolas"/>
+          <w:color w:val="B03060"/>
+          <w:sz w:val="19"/>
+        </w:rPr>
+        <w:t>docker exec hello-multistage id</w:t>
+      </w:r>
+      <w:r>
+        <w:t xml:space="preserve"> returns </w:t>
+      </w:r>
+      <w:r>
+        <w:rPr>
+          <w:rFonts w:ascii="Consolas" w:hAnsi="Consolas"/>
+          <w:color w:val="B03060"/>
+          <w:sz w:val="19"/>
+        </w:rPr>
+        <w:t>uid=10001(appuser) gid=10001(appuser)</w:t>
+      </w:r>
+      <w:r>
+        <w:t xml:space="preserve">. That is busybox's </w:t>
+      </w:r>
+      <w:r>
+        <w:rPr>
+          <w:rFonts w:ascii="Consolas" w:hAnsi="Consolas"/>
+          <w:color w:val="B03060"/>
+          <w:sz w:val="19"/>
+        </w:rPr>
+        <w:t>adduser</w:t>
+      </w:r>
+      <w:r>
+        <w:t xml:space="preserve"> inside Alpine rather than Debian's Perl one, and </w:t>
+      </w:r>
+      <w:r>
+        <w:rPr>
+          <w:rFonts w:ascii="Consolas" w:hAnsi="Consolas"/>
+          <w:color w:val="B03060"/>
+          <w:sz w:val="19"/>
+        </w:rPr>
+        <w:t>-D</w:t>
+      </w:r>
+      <w:r>
+        <w:t xml:space="preserve"> means "no password". Same principle: explicit flags, no prompts, reproducible every build.</w:t>
+      </w:r>
+    </w:p>
+    <w:p>
+      <w:pPr>
+        <w:pStyle w:val="Heading3"/>
+      </w:pPr>
+      <w:r>
+        <w:t>Cleanup</w:t>
+      </w:r>
+    </w:p>
+    <w:p>
+      <w:pPr>
+        <w:spacing w:before="120" w:after="120" w:line="240" w:lineRule="auto"/>
+        <w:ind w:left="360"/>
+      </w:pPr>
+      <w:r>
+        <w:rPr>
+          <w:rFonts w:ascii="Consolas" w:hAnsi="Consolas"/>
+          <w:color w:val="1A1A1A"/>
+          <w:sz w:val="17"/>
+        </w:rPr>
+        <w:t>root@usertest:/# deluser --remove-home devops_test</w:t>
+      </w:r>
+      <w:r>
+        <w:rPr>
+          <w:rFonts w:ascii="Consolas" w:hAnsi="Consolas"/>
+          <w:color w:val="1A1A1A"/>
+          <w:sz w:val="17"/>
+        </w:rPr>
+        <w:br/>
+        <w:t>/usr/sbin/deluser: In order to use the --remove-home, --remove-all-files, and --backup features,</w:t>
+      </w:r>
+      <w:r>
+        <w:rPr>
+          <w:rFonts w:ascii="Consolas" w:hAnsi="Consolas"/>
+          <w:color w:val="1A1A1A"/>
+          <w:sz w:val="17"/>
+        </w:rPr>
+        <w:br/>
+        <w:t>you need to install the `perl' package. To accomplish that, run</w:t>
+      </w:r>
+      <w:r>
+        <w:rPr>
+          <w:rFonts w:ascii="Consolas" w:hAnsi="Consolas"/>
+          <w:color w:val="1A1A1A"/>
+          <w:sz w:val="17"/>
+        </w:rPr>
+        <w:br/>
+        <w:t>apt-get install perl.</w:t>
+      </w:r>
+    </w:p>
+    <w:p>
+      <w:r>
+        <w:t xml:space="preserve">Worth knowing: </w:t>
+      </w:r>
+      <w:r>
+        <w:rPr>
+          <w:rFonts w:ascii="Consolas" w:hAnsi="Consolas"/>
+          <w:color w:val="B03060"/>
+          <w:sz w:val="19"/>
+        </w:rPr>
+        <w:t>deluser</w:t>
+      </w:r>
+      <w:r>
+        <w:t xml:space="preserve"> is a Perl script, and the </w:t>
+      </w:r>
+      <w:r>
+        <w:rPr>
+          <w:rFonts w:ascii="Consolas" w:hAnsi="Consolas"/>
+          <w:color w:val="B03060"/>
+          <w:sz w:val="19"/>
+        </w:rPr>
+        <w:t>ubuntu:22.04</w:t>
+      </w:r>
+      <w:r>
+        <w:t xml:space="preserve"> base image is stripped down far enough that Perl is not installed. </w:t>
+      </w:r>
+      <w:r>
+        <w:rPr>
+          <w:rFonts w:ascii="Consolas" w:hAnsi="Consolas"/>
+          <w:color w:val="B03060"/>
+          <w:sz w:val="19"/>
+        </w:rPr>
+        <w:t>adduser</w:t>
+      </w:r>
+      <w:r>
+        <w:t xml:space="preserve"> itself works because it degrades gracefully; </w:t>
+      </w:r>
+      <w:r>
+        <w:rPr>
+          <w:rFonts w:ascii="Consolas" w:hAnsi="Consolas"/>
+          <w:color w:val="B03060"/>
+          <w:sz w:val="19"/>
+        </w:rPr>
+        <w:t>--remove-home</w:t>
+      </w:r>
+      <w:r>
+        <w:t xml:space="preserve"> does not. After </w:t>
+      </w:r>
+      <w:r>
+        <w:rPr>
+          <w:rFonts w:ascii="Consolas" w:hAnsi="Consolas"/>
+          <w:color w:val="B03060"/>
+          <w:sz w:val="19"/>
+        </w:rPr>
+        <w:t>apt-get install -y perl</w:t>
+      </w:r>
+      <w:r>
+        <w:t>:</w:t>
+      </w:r>
+    </w:p>
+    <w:p>
+      <w:pPr>
+        <w:spacing w:before="120" w:after="120" w:line="240" w:lineRule="auto"/>
+        <w:ind w:left="360"/>
+      </w:pPr>
+      <w:r>
+        <w:rPr>
+          <w:rFonts w:ascii="Consolas" w:hAnsi="Consolas"/>
+          <w:color w:val="1A1A1A"/>
+          <w:sz w:val="17"/>
+        </w:rPr>
+        <w:t>root@usertest:/# deluser --remove-home devops_test</w:t>
+      </w:r>
+      <w:r>
+        <w:rPr>
+          <w:rFonts w:ascii="Consolas" w:hAnsi="Consolas"/>
+          <w:color w:val="1A1A1A"/>
+          <w:sz w:val="17"/>
+        </w:rPr>
+        <w:br/>
+        <w:t>Looking for files to backup/remove ...</w:t>
+      </w:r>
+      <w:r>
+        <w:rPr>
+          <w:rFonts w:ascii="Consolas" w:hAnsi="Consolas"/>
+          <w:color w:val="1A1A1A"/>
+          <w:sz w:val="17"/>
+        </w:rPr>
+        <w:br/>
+        <w:t>Removing files ...</w:t>
+      </w:r>
+      <w:r>
+        <w:rPr>
+          <w:rFonts w:ascii="Consolas" w:hAnsi="Consolas"/>
+          <w:color w:val="1A1A1A"/>
+          <w:sz w:val="17"/>
+        </w:rPr>
+        <w:br/>
+        <w:t>Removing user `devops_test' ...</w:t>
+      </w:r>
+      <w:r>
+        <w:rPr>
+          <w:rFonts w:ascii="Consolas" w:hAnsi="Consolas"/>
+          <w:color w:val="1A1A1A"/>
+          <w:sz w:val="17"/>
+        </w:rPr>
+        <w:br/>
+        <w:t>Warning: group `devops_test' has no more members.</w:t>
+      </w:r>
+      <w:r>
+        <w:rPr>
+          <w:rFonts w:ascii="Consolas" w:hAnsi="Consolas"/>
+          <w:color w:val="1A1A1A"/>
+          <w:sz w:val="17"/>
+        </w:rPr>
+        <w:br/>
+        <w:t>Done.</w:t>
+      </w:r>
+      <w:r>
+        <w:rPr>
+          <w:rFonts w:ascii="Consolas" w:hAnsi="Consolas"/>
+          <w:color w:val="1A1A1A"/>
+          <w:sz w:val="17"/>
+        </w:rPr>
+        <w:br/>
+        <w:t>root@usertest:/# userdel -r useradd_test</w:t>
+      </w:r>
+      <w:r>
+        <w:rPr>
+          <w:rFonts w:ascii="Consolas" w:hAnsi="Consolas"/>
+          <w:color w:val="1A1A1A"/>
+          <w:sz w:val="17"/>
+        </w:rPr>
+        <w:br/>
+        <w:t>userdel: useradd_test mail spool (/var/mail/useradd_test) not found</w:t>
+      </w:r>
+      <w:r>
+        <w:rPr>
+          <w:rFonts w:ascii="Consolas" w:hAnsi="Consolas"/>
+          <w:color w:val="1A1A1A"/>
+          <w:sz w:val="17"/>
+        </w:rPr>
+        <w:br/>
+        <w:t>userdel: useradd_test home directory (/home/useradd_test) not found</w:t>
+      </w:r>
+      <w:r>
+        <w:rPr>
+          <w:rFonts w:ascii="Consolas" w:hAnsi="Consolas"/>
+          <w:color w:val="1A1A1A"/>
+          <w:sz w:val="17"/>
+        </w:rPr>
+        <w:br/>
+        <w:t>root@usertest:/# getent passwd devops_test useradd_test; echo "exit status: $?"</w:t>
+      </w:r>
+      <w:r>
+        <w:rPr>
+          <w:rFonts w:ascii="Consolas" w:hAnsi="Consolas"/>
+          <w:color w:val="1A1A1A"/>
+          <w:sz w:val="17"/>
+        </w:rPr>
+        <w:br/>
+        <w:t>exit status: 2</w:t>
+      </w:r>
+      <w:r>
+        <w:rPr>
+          <w:rFonts w:ascii="Consolas" w:hAnsi="Consolas"/>
+          <w:color w:val="1A1A1A"/>
+          <w:sz w:val="17"/>
+        </w:rPr>
+        <w:br/>
+        <w:t>root@usertest:/# ls /home</w:t>
+      </w:r>
+    </w:p>
+    <w:p>
+      <w:r>
+        <w:rPr>
+          <w:rFonts w:ascii="Consolas" w:hAnsi="Consolas"/>
+          <w:color w:val="B03060"/>
+          <w:sz w:val="19"/>
+        </w:rPr>
+        <w:t>userdel -r</w:t>
+      </w:r>
+      <w:r>
+        <w:t xml:space="preserve"> complained about the missing home directory and mail spool, which tracks with </w:t>
+      </w:r>
+      <w:r>
+        <w:rPr>
+          <w:rFonts w:ascii="Consolas" w:hAnsi="Consolas"/>
+          <w:color w:val="B03060"/>
+          <w:sz w:val="19"/>
+        </w:rPr>
+        <w:t>useradd</w:t>
+      </w:r>
+      <w:r>
+        <w:t xml:space="preserve"> never having created either. Empty output from </w:t>
+      </w:r>
+      <w:r>
+        <w:rPr>
+          <w:rFonts w:ascii="Consolas" w:hAnsi="Consolas"/>
+          <w:color w:val="B03060"/>
+          <w:sz w:val="19"/>
+        </w:rPr>
+        <w:t>getent</w:t>
+      </w:r>
+      <w:r>
+        <w:t xml:space="preserve"> and exit status 2 means neither account exists any more, and </w:t>
+      </w:r>
+      <w:r>
+        <w:rPr>
+          <w:rFonts w:ascii="Consolas" w:hAnsi="Consolas"/>
+          <w:color w:val="B03060"/>
+          <w:sz w:val="19"/>
+        </w:rPr>
+        <w:t>/home</w:t>
+      </w:r>
+      <w:r>
+        <w:t xml:space="preserve"> is empty.</w:t>
+      </w:r>
+    </w:p>
+    <w:p>
+      <w:r>
+        <w:t>Then the container itself goes away:</w:t>
+      </w:r>
+    </w:p>
+    <w:p>
+      <w:pPr>
+        <w:spacing w:before="120" w:after="120" w:line="240" w:lineRule="auto"/>
+        <w:ind w:left="360"/>
+      </w:pPr>
+      <w:r>
+        <w:rPr>
+          <w:rFonts w:ascii="Consolas" w:hAnsi="Consolas"/>
+          <w:color w:val="1A1A1A"/>
+          <w:sz w:val="17"/>
+        </w:rPr>
+        <w:t>akshat@AK-work:~$ docker rm -f usertest</w:t>
+      </w:r>
+      <w:r>
+        <w:rPr>
+          <w:rFonts w:ascii="Consolas" w:hAnsi="Consolas"/>
+          <w:color w:val="1A1A1A"/>
+          <w:sz w:val="17"/>
+        </w:rPr>
+        <w:br/>
+        <w:t>usertest</w:t>
       </w:r>
     </w:p>
     <w:p>
@@ -14425,6 +14865,134 @@
           </w:tcPr>
           <w:p>
             <w:r>
+              <w:t xml:space="preserve">Task 2 — </w:t>
+            </w:r>
+            <w:r>
+              <w:rPr>
+                <w:rFonts w:ascii="Consolas" w:hAnsi="Consolas"/>
+                <w:color w:val="B03060"/>
+                <w:sz w:val="19"/>
+              </w:rPr>
+              <w:t>adduser</w:t>
+            </w:r>
+            <w:r>
+              <w:t>, start to finish</w:t>
+            </w:r>
+          </w:p>
+        </w:tc>
+        <w:tc>
+          <w:tcPr>
+            <w:tcW w:type="dxa" w:w="4320"/>
+          </w:tcPr>
+          <w:p>
+            <w:r>
+              <w:drawing>
+                <wp:inline xmlns:a="http://schemas.openxmlformats.org/drawingml/2006/main" xmlns:pic="http://schemas.openxmlformats.org/drawingml/2006/picture">
+                  <wp:extent cx="3291840" cy="3376879"/>
+                  <wp:docPr id="4" name="Picture 4"/>
+                  <wp:cNvGraphicFramePr>
+                    <a:graphicFrameLocks noChangeAspect="1"/>
+                  </wp:cNvGraphicFramePr>
+                  <a:graphic>
+                    <a:graphicData uri="http://schemas.openxmlformats.org/drawingml/2006/picture">
+                      <pic:pic>
+                        <pic:nvPicPr>
+                          <pic:cNvPr id="0" name="task2-adduser-run.png"/>
+                          <pic:cNvPicPr/>
+                        </pic:nvPicPr>
+                        <pic:blipFill>
+                          <a:blip r:embed="rId12"/>
+                          <a:stretch>
+                            <a:fillRect/>
+                          </a:stretch>
+                        </pic:blipFill>
+                        <pic:spPr>
+                          <a:xfrm>
+                            <a:off x="0" y="0"/>
+                            <a:ext cx="3291840" cy="3376879"/>
+                          </a:xfrm>
+                          <a:prstGeom prst="rect"/>
+                        </pic:spPr>
+                      </pic:pic>
+                    </a:graphicData>
+                  </a:graphic>
+                </wp:inline>
+              </w:drawing>
+            </w:r>
+          </w:p>
+        </w:tc>
+      </w:tr>
+      <w:tr>
+        <w:tc>
+          <w:tcPr>
+            <w:tcW w:type="dxa" w:w="4320"/>
+          </w:tcPr>
+          <w:p>
+            <w:r>
+              <w:t xml:space="preserve">Task 2 — plain </w:t>
+            </w:r>
+            <w:r>
+              <w:rPr>
+                <w:rFonts w:ascii="Consolas" w:hAnsi="Consolas"/>
+                <w:color w:val="B03060"/>
+                <w:sz w:val="19"/>
+              </w:rPr>
+              <w:t>useradd</w:t>
+            </w:r>
+            <w:r>
+              <w:t>, and the cleanup</w:t>
+            </w:r>
+          </w:p>
+        </w:tc>
+        <w:tc>
+          <w:tcPr>
+            <w:tcW w:type="dxa" w:w="4320"/>
+          </w:tcPr>
+          <w:p>
+            <w:r>
+              <w:drawing>
+                <wp:inline xmlns:a="http://schemas.openxmlformats.org/drawingml/2006/main" xmlns:pic="http://schemas.openxmlformats.org/drawingml/2006/picture">
+                  <wp:extent cx="3291840" cy="2169871"/>
+                  <wp:docPr id="5" name="Picture 5"/>
+                  <wp:cNvGraphicFramePr>
+                    <a:graphicFrameLocks noChangeAspect="1"/>
+                  </wp:cNvGraphicFramePr>
+                  <a:graphic>
+                    <a:graphicData uri="http://schemas.openxmlformats.org/drawingml/2006/picture">
+                      <pic:pic>
+                        <pic:nvPicPr>
+                          <pic:cNvPr id="0" name="task2-useradd-contrast.png"/>
+                          <pic:cNvPicPr/>
+                        </pic:nvPicPr>
+                        <pic:blipFill>
+                          <a:blip r:embed="rId13"/>
+                          <a:stretch>
+                            <a:fillRect/>
+                          </a:stretch>
+                        </pic:blipFill>
+                        <pic:spPr>
+                          <a:xfrm>
+                            <a:off x="0" y="0"/>
+                            <a:ext cx="3291840" cy="2169871"/>
+                          </a:xfrm>
+                          <a:prstGeom prst="rect"/>
+                        </pic:spPr>
+                      </pic:pic>
+                    </a:graphicData>
+                  </a:graphic>
+                </wp:inline>
+              </w:drawing>
+            </w:r>
+          </w:p>
+        </w:tc>
+      </w:tr>
+      <w:tr>
+        <w:tc>
+          <w:tcPr>
+            <w:tcW w:type="dxa" w:w="4320"/>
+          </w:tcPr>
+          <w:p>
+            <w:r>
               <w:t xml:space="preserve">Task 3 — </w:t>
             </w:r>
             <w:r>
@@ -14449,7 +15017,7 @@
               <w:drawing>
                 <wp:inline xmlns:a="http://schemas.openxmlformats.org/drawingml/2006/main" xmlns:pic="http://schemas.openxmlformats.org/drawingml/2006/picture">
                   <wp:extent cx="3291840" cy="6097386"/>
-                  <wp:docPr id="4" name="Picture 4"/>
+                  <wp:docPr id="6" name="Picture 6"/>
                   <wp:cNvGraphicFramePr>
                     <a:graphicFrameLocks noChangeAspect="1"/>
                   </wp:cNvGraphicFramePr>
@@ -14461,7 +15029,7 @@
                           <pic:cNvPicPr/>
                         </pic:nvPicPr>
                         <pic:blipFill>
-                          <a:blip r:embed="rId12"/>
+                          <a:blip r:embed="rId14"/>
                           <a:stretch>
                             <a:fillRect/>
                           </a:stretch>
@@ -14513,7 +15081,7 @@
               <w:drawing>
                 <wp:inline xmlns:a="http://schemas.openxmlformats.org/drawingml/2006/main" xmlns:pic="http://schemas.openxmlformats.org/drawingml/2006/picture">
                   <wp:extent cx="3291840" cy="4813140"/>
-                  <wp:docPr id="5" name="Picture 5"/>
+                  <wp:docPr id="7" name="Picture 7"/>
                   <wp:cNvGraphicFramePr>
                     <a:graphicFrameLocks noChangeAspect="1"/>
                   </wp:cNvGraphicFramePr>
@@ -14525,7 +15093,7 @@
                           <pic:cNvPicPr/>
                         </pic:nvPicPr>
                         <pic:blipFill>
-                          <a:blip r:embed="rId13"/>
+                          <a:blip r:embed="rId15"/>
                           <a:stretch>
                             <a:fillRect/>
                           </a:stretch>

</xml_diff>